<commit_message>
Updated the different Idea documents.
</commit_message>
<xml_diff>
--- a/Portal_Database_Design/Chains_Classes_Explanantion.docx
+++ b/Portal_Database_Design/Chains_Classes_Explanantion.docx
@@ -532,11 +532,345 @@
       </w:pPr>
       <w:r>
         <w:rPr/>
-        <w:t xml:space="preserve">So, </w:t>
-      </w:r>
-      <w:r>
-        <w:rPr/>
-        <w:t xml:space="preserve"> "this.chainsService.createChain()", "this.chainsService.findAllChains()", etc. refer to the methods of that particular instance of the ChainsService class.</w:t>
+        <w:t>So,  "this.chainsService.createChain()", "this.chainsService.findAllChains()", etc. refer to the methods of that particular instance of the ChainsService class.</w:t>
+      </w:r>
+    </w:p>
+    <w:p>
+      <w:pPr>
+        <w:pStyle w:val="BodyText"/>
+        <w:bidi w:val="0"/>
+        <w:spacing w:lineRule="auto" w:line="276" w:before="0" w:after="140"/>
+        <w:jc w:val="start"/>
+        <w:rPr/>
+      </w:pPr>
+      <w:r>
+        <w:rPr/>
+      </w:r>
+    </w:p>
+    <w:p>
+      <w:pPr>
+        <w:pStyle w:val="BodyText"/>
+        <w:bidi w:val="0"/>
+        <w:spacing w:lineRule="auto" w:line="276" w:before="0" w:after="140"/>
+        <w:jc w:val="start"/>
+        <w:rPr/>
+      </w:pPr>
+      <w:r>
+        <w:rPr/>
+        <w:t>Yes, exactly.</w:t>
+      </w:r>
+    </w:p>
+    <w:p>
+      <w:pPr>
+        <w:pStyle w:val="BodyText"/>
+        <w:rPr/>
+      </w:pPr>
+      <w:r>
+        <w:rPr/>
+        <w:t>The dependency chain is:</w:t>
+      </w:r>
+    </w:p>
+    <w:p>
+      <w:pPr>
+        <w:pStyle w:val="PreformattedText"/>
+        <w:rPr/>
+      </w:pPr>
+      <w:r>
+        <w:rPr>
+          <w:rStyle w:val="SourceText"/>
+        </w:rPr>
+        <w:t>PrismaService</w:t>
+      </w:r>
+    </w:p>
+    <w:p>
+      <w:pPr>
+        <w:pStyle w:val="PreformattedText"/>
+        <w:rPr/>
+      </w:pPr>
+      <w:r>
+        <w:rPr>
+          <w:rStyle w:val="SourceText"/>
+        </w:rPr>
+        <w:t xml:space="preserve">      ↓ </w:t>
+      </w:r>
+      <w:r>
+        <w:rPr>
+          <w:rStyle w:val="SourceText"/>
+        </w:rPr>
+        <w:t>injected into</w:t>
+      </w:r>
+    </w:p>
+    <w:p>
+      <w:pPr>
+        <w:pStyle w:val="PreformattedText"/>
+        <w:rPr/>
+      </w:pPr>
+      <w:r>
+        <w:rPr>
+          <w:rStyle w:val="SourceText"/>
+        </w:rPr>
+        <w:t>ChainsService</w:t>
+      </w:r>
+    </w:p>
+    <w:p>
+      <w:pPr>
+        <w:pStyle w:val="PreformattedText"/>
+        <w:rPr/>
+      </w:pPr>
+      <w:r>
+        <w:rPr>
+          <w:rStyle w:val="SourceText"/>
+        </w:rPr>
+        <w:t xml:space="preserve">      ↓ </w:t>
+      </w:r>
+      <w:r>
+        <w:rPr>
+          <w:rStyle w:val="SourceText"/>
+        </w:rPr>
+        <w:t>injected into</w:t>
+      </w:r>
+    </w:p>
+    <w:p>
+      <w:pPr>
+        <w:pStyle w:val="PreformattedText"/>
+        <w:spacing w:before="0" w:after="283"/>
+        <w:rPr/>
+      </w:pPr>
+      <w:r>
+        <w:rPr>
+          <w:rStyle w:val="SourceText"/>
+        </w:rPr>
+        <w:t>ChainsController</w:t>
+      </w:r>
+    </w:p>
+    <w:p>
+      <w:pPr>
+        <w:pStyle w:val="BodyText"/>
+        <w:rPr/>
+      </w:pPr>
+      <w:r>
+        <w:rPr/>
+        <w:t>So:</w:t>
+      </w:r>
+    </w:p>
+    <w:p>
+      <w:pPr>
+        <w:pStyle w:val="BodyText"/>
+        <w:numPr>
+          <w:ilvl w:val="0"/>
+          <w:numId w:val="1"/>
+        </w:numPr>
+        <w:tabs>
+          <w:tab w:val="clear" w:pos="709"/>
+          <w:tab w:val="left" w:pos="0" w:leader="none"/>
+        </w:tabs>
+        <w:ind w:hanging="283" w:start="709"/>
+        <w:rPr/>
+      </w:pPr>
+      <w:r>
+        <w:rPr>
+          <w:rStyle w:val="SourceText"/>
+        </w:rPr>
+        <w:t>ChainsService</w:t>
+      </w:r>
+      <w:r>
+        <w:rPr/>
+        <w:t xml:space="preserve"> depends on </w:t>
+      </w:r>
+      <w:r>
+        <w:rPr>
+          <w:rStyle w:val="SourceText"/>
+        </w:rPr>
+        <w:t>PrismaService</w:t>
+      </w:r>
+      <w:r>
+        <w:rPr/>
+        <w:t xml:space="preserve"> to interact with the database.</w:t>
+      </w:r>
+    </w:p>
+    <w:p>
+      <w:pPr>
+        <w:pStyle w:val="BodyText"/>
+        <w:numPr>
+          <w:ilvl w:val="0"/>
+          <w:numId w:val="1"/>
+        </w:numPr>
+        <w:tabs>
+          <w:tab w:val="clear" w:pos="709"/>
+          <w:tab w:val="left" w:pos="0" w:leader="none"/>
+        </w:tabs>
+        <w:ind w:hanging="283" w:start="709"/>
+        <w:rPr/>
+      </w:pPr>
+      <w:r>
+        <w:rPr>
+          <w:rStyle w:val="SourceText"/>
+        </w:rPr>
+        <w:t>ChainsController</w:t>
+      </w:r>
+      <w:r>
+        <w:rPr/>
+        <w:t xml:space="preserve"> depends on </w:t>
+      </w:r>
+      <w:r>
+        <w:rPr>
+          <w:rStyle w:val="SourceText"/>
+        </w:rPr>
+        <w:t>ChainsService</w:t>
+      </w:r>
+      <w:r>
+        <w:rPr/>
+        <w:t xml:space="preserve"> to perform the application/business operations.</w:t>
+      </w:r>
+    </w:p>
+    <w:p>
+      <w:pPr>
+        <w:pStyle w:val="BodyText"/>
+        <w:numPr>
+          <w:ilvl w:val="0"/>
+          <w:numId w:val="1"/>
+        </w:numPr>
+        <w:tabs>
+          <w:tab w:val="clear" w:pos="709"/>
+          <w:tab w:val="left" w:pos="0" w:leader="none"/>
+        </w:tabs>
+        <w:ind w:hanging="283" w:start="709"/>
+        <w:rPr/>
+      </w:pPr>
+      <w:r>
+        <w:rPr/>
+        <w:t>NestJS's dependency-injection system creates these objects and supplies their dependencies.</w:t>
+      </w:r>
+    </w:p>
+    <w:p>
+      <w:pPr>
+        <w:pStyle w:val="BodyText"/>
+        <w:rPr/>
+      </w:pPr>
+      <w:r>
+        <w:rPr/>
+        <w:t>Conceptually:</w:t>
+      </w:r>
+    </w:p>
+    <w:p>
+      <w:pPr>
+        <w:pStyle w:val="PreformattedText"/>
+        <w:rPr/>
+      </w:pPr>
+      <w:r>
+        <w:rPr>
+          <w:rStyle w:val="SourceText"/>
+        </w:rPr>
+        <w:t>HTTP request</w:t>
+      </w:r>
+    </w:p>
+    <w:p>
+      <w:pPr>
+        <w:pStyle w:val="PreformattedText"/>
+        <w:rPr/>
+      </w:pPr>
+      <w:r>
+        <w:rPr>
+          <w:rStyle w:val="SourceText"/>
+        </w:rPr>
+        <w:t xml:space="preserve">    ↓</w:t>
+      </w:r>
+    </w:p>
+    <w:p>
+      <w:pPr>
+        <w:pStyle w:val="PreformattedText"/>
+        <w:rPr/>
+      </w:pPr>
+      <w:r>
+        <w:rPr>
+          <w:rStyle w:val="SourceText"/>
+        </w:rPr>
+        <w:t>ChainsController</w:t>
+      </w:r>
+    </w:p>
+    <w:p>
+      <w:pPr>
+        <w:pStyle w:val="PreformattedText"/>
+        <w:rPr/>
+      </w:pPr>
+      <w:r>
+        <w:rPr>
+          <w:rStyle w:val="SourceText"/>
+        </w:rPr>
+        <w:t xml:space="preserve">    ↓</w:t>
+      </w:r>
+    </w:p>
+    <w:p>
+      <w:pPr>
+        <w:pStyle w:val="PreformattedText"/>
+        <w:rPr/>
+      </w:pPr>
+      <w:r>
+        <w:rPr>
+          <w:rStyle w:val="SourceText"/>
+        </w:rPr>
+        <w:t>ChainsService</w:t>
+      </w:r>
+    </w:p>
+    <w:p>
+      <w:pPr>
+        <w:pStyle w:val="PreformattedText"/>
+        <w:rPr/>
+      </w:pPr>
+      <w:r>
+        <w:rPr>
+          <w:rStyle w:val="SourceText"/>
+        </w:rPr>
+        <w:t xml:space="preserve">    ↓</w:t>
+      </w:r>
+    </w:p>
+    <w:p>
+      <w:pPr>
+        <w:pStyle w:val="PreformattedText"/>
+        <w:rPr/>
+      </w:pPr>
+      <w:r>
+        <w:rPr>
+          <w:rStyle w:val="SourceText"/>
+        </w:rPr>
+        <w:t>PrismaService</w:t>
+      </w:r>
+    </w:p>
+    <w:p>
+      <w:pPr>
+        <w:pStyle w:val="PreformattedText"/>
+        <w:rPr/>
+      </w:pPr>
+      <w:r>
+        <w:rPr>
+          <w:rStyle w:val="SourceText"/>
+        </w:rPr>
+        <w:t xml:space="preserve">    ↓</w:t>
+      </w:r>
+    </w:p>
+    <w:p>
+      <w:pPr>
+        <w:pStyle w:val="PreformattedText"/>
+        <w:spacing w:before="0" w:after="283"/>
+        <w:rPr/>
+      </w:pPr>
+      <w:r>
+        <w:rPr>
+          <w:rStyle w:val="SourceText"/>
+        </w:rPr>
+        <w:t>PostgreSQL</w:t>
+      </w:r>
+    </w:p>
+    <w:p>
+      <w:pPr>
+        <w:pStyle w:val="BodyText"/>
+        <w:bidi w:val="0"/>
+        <w:spacing w:lineRule="auto" w:line="276" w:before="0" w:after="140"/>
+        <w:jc w:val="start"/>
+        <w:rPr/>
+      </w:pPr>
+      <w:r>
+        <w:rPr/>
       </w:r>
     </w:p>
     <w:sectPr>
@@ -550,6 +884,273 @@
     </w:sectPr>
   </w:body>
 </w:document>
+</file>
+
+<file path=word/numbering.xml><?xml version="1.0" encoding="utf-8"?>
+<w:numbering xmlns:w="http://schemas.openxmlformats.org/wordprocessingml/2006/main" xmlns:o="urn:schemas-microsoft-com:office:office" xmlns:r="http://schemas.openxmlformats.org/officeDocument/2006/relationships" xmlns:v="urn:schemas-microsoft-com:vml" xmlns:mc="http://schemas.openxmlformats.org/markup-compatibility/2006" xmlns:w14="http://schemas.microsoft.com/office/word/2010/wordml" mc:Ignorable="w14">
+  <w:abstractNum w:abstractNumId="1">
+    <w:lvl w:ilvl="0">
+      <w:start w:val="1"/>
+      <w:numFmt w:val="bullet"/>
+      <w:lvlText w:val=""/>
+      <w:lvlJc w:val="start"/>
+      <w:pPr>
+        <w:tabs>
+          <w:tab w:val="num" w:pos="709"/>
+        </w:tabs>
+        <w:ind w:start="709" w:hanging="283"/>
+      </w:pPr>
+      <w:rPr>
+        <w:rFonts w:ascii="Symbol" w:hAnsi="Symbol" w:cs="Symbol" w:hint="default"/>
+      </w:rPr>
+    </w:lvl>
+    <w:lvl w:ilvl="1">
+      <w:start w:val="1"/>
+      <w:numFmt w:val="bullet"/>
+      <w:lvlText w:val=""/>
+      <w:lvlJc w:val="start"/>
+      <w:pPr>
+        <w:tabs>
+          <w:tab w:val="num" w:pos="1418"/>
+        </w:tabs>
+        <w:ind w:start="1418" w:hanging="283"/>
+      </w:pPr>
+      <w:rPr>
+        <w:rFonts w:ascii="Symbol" w:hAnsi="Symbol" w:cs="Symbol" w:hint="default"/>
+      </w:rPr>
+    </w:lvl>
+    <w:lvl w:ilvl="2">
+      <w:start w:val="1"/>
+      <w:numFmt w:val="bullet"/>
+      <w:lvlText w:val=""/>
+      <w:lvlJc w:val="start"/>
+      <w:pPr>
+        <w:tabs>
+          <w:tab w:val="num" w:pos="2127"/>
+        </w:tabs>
+        <w:ind w:start="2127" w:hanging="283"/>
+      </w:pPr>
+      <w:rPr>
+        <w:rFonts w:ascii="Symbol" w:hAnsi="Symbol" w:cs="Symbol" w:hint="default"/>
+      </w:rPr>
+    </w:lvl>
+    <w:lvl w:ilvl="3">
+      <w:start w:val="1"/>
+      <w:numFmt w:val="bullet"/>
+      <w:lvlText w:val=""/>
+      <w:lvlJc w:val="start"/>
+      <w:pPr>
+        <w:tabs>
+          <w:tab w:val="num" w:pos="2836"/>
+        </w:tabs>
+        <w:ind w:start="2836" w:hanging="283"/>
+      </w:pPr>
+      <w:rPr>
+        <w:rFonts w:ascii="Symbol" w:hAnsi="Symbol" w:cs="Symbol" w:hint="default"/>
+      </w:rPr>
+    </w:lvl>
+    <w:lvl w:ilvl="4">
+      <w:start w:val="1"/>
+      <w:numFmt w:val="bullet"/>
+      <w:lvlText w:val=""/>
+      <w:lvlJc w:val="start"/>
+      <w:pPr>
+        <w:tabs>
+          <w:tab w:val="num" w:pos="3545"/>
+        </w:tabs>
+        <w:ind w:start="3545" w:hanging="283"/>
+      </w:pPr>
+      <w:rPr>
+        <w:rFonts w:ascii="Symbol" w:hAnsi="Symbol" w:cs="Symbol" w:hint="default"/>
+      </w:rPr>
+    </w:lvl>
+    <w:lvl w:ilvl="5">
+      <w:start w:val="1"/>
+      <w:numFmt w:val="bullet"/>
+      <w:lvlText w:val=""/>
+      <w:lvlJc w:val="start"/>
+      <w:pPr>
+        <w:tabs>
+          <w:tab w:val="num" w:pos="4254"/>
+        </w:tabs>
+        <w:ind w:start="4254" w:hanging="283"/>
+      </w:pPr>
+      <w:rPr>
+        <w:rFonts w:ascii="Symbol" w:hAnsi="Symbol" w:cs="Symbol" w:hint="default"/>
+      </w:rPr>
+    </w:lvl>
+    <w:lvl w:ilvl="6">
+      <w:start w:val="1"/>
+      <w:numFmt w:val="bullet"/>
+      <w:lvlText w:val=""/>
+      <w:lvlJc w:val="start"/>
+      <w:pPr>
+        <w:tabs>
+          <w:tab w:val="num" w:pos="4963"/>
+        </w:tabs>
+        <w:ind w:start="4963" w:hanging="283"/>
+      </w:pPr>
+      <w:rPr>
+        <w:rFonts w:ascii="Symbol" w:hAnsi="Symbol" w:cs="Symbol" w:hint="default"/>
+      </w:rPr>
+    </w:lvl>
+    <w:lvl w:ilvl="7">
+      <w:start w:val="1"/>
+      <w:numFmt w:val="bullet"/>
+      <w:lvlText w:val=""/>
+      <w:lvlJc w:val="start"/>
+      <w:pPr>
+        <w:tabs>
+          <w:tab w:val="num" w:pos="5672"/>
+        </w:tabs>
+        <w:ind w:start="5672" w:hanging="283"/>
+      </w:pPr>
+      <w:rPr>
+        <w:rFonts w:ascii="Symbol" w:hAnsi="Symbol" w:cs="Symbol" w:hint="default"/>
+      </w:rPr>
+    </w:lvl>
+    <w:lvl w:ilvl="8">
+      <w:start w:val="1"/>
+      <w:numFmt w:val="bullet"/>
+      <w:lvlText w:val=""/>
+      <w:lvlJc w:val="start"/>
+      <w:pPr>
+        <w:tabs>
+          <w:tab w:val="num" w:pos="6381"/>
+        </w:tabs>
+        <w:ind w:start="6381" w:hanging="283"/>
+      </w:pPr>
+      <w:rPr>
+        <w:rFonts w:ascii="Symbol" w:hAnsi="Symbol" w:cs="Symbol" w:hint="default"/>
+      </w:rPr>
+    </w:lvl>
+  </w:abstractNum>
+  <w:abstractNum w:abstractNumId="2">
+    <w:lvl w:ilvl="0">
+      <w:start w:val="1"/>
+      <w:numFmt w:val="none"/>
+      <w:suff w:val="nothing"/>
+      <w:lvlText w:val=""/>
+      <w:lvlJc w:val="start"/>
+      <w:pPr>
+        <w:tabs>
+          <w:tab w:val="num" w:pos="0"/>
+        </w:tabs>
+        <w:ind w:start="0" w:hanging="0"/>
+      </w:pPr>
+    </w:lvl>
+    <w:lvl w:ilvl="1">
+      <w:start w:val="1"/>
+      <w:numFmt w:val="none"/>
+      <w:suff w:val="nothing"/>
+      <w:lvlText w:val=""/>
+      <w:lvlJc w:val="start"/>
+      <w:pPr>
+        <w:tabs>
+          <w:tab w:val="num" w:pos="0"/>
+        </w:tabs>
+        <w:ind w:start="0" w:hanging="0"/>
+      </w:pPr>
+    </w:lvl>
+    <w:lvl w:ilvl="2">
+      <w:start w:val="1"/>
+      <w:numFmt w:val="none"/>
+      <w:suff w:val="nothing"/>
+      <w:lvlText w:val=""/>
+      <w:lvlJc w:val="start"/>
+      <w:pPr>
+        <w:tabs>
+          <w:tab w:val="num" w:pos="0"/>
+        </w:tabs>
+        <w:ind w:start="0" w:hanging="0"/>
+      </w:pPr>
+    </w:lvl>
+    <w:lvl w:ilvl="3">
+      <w:start w:val="1"/>
+      <w:numFmt w:val="none"/>
+      <w:suff w:val="nothing"/>
+      <w:lvlText w:val=""/>
+      <w:lvlJc w:val="start"/>
+      <w:pPr>
+        <w:tabs>
+          <w:tab w:val="num" w:pos="0"/>
+        </w:tabs>
+        <w:ind w:start="0" w:hanging="0"/>
+      </w:pPr>
+    </w:lvl>
+    <w:lvl w:ilvl="4">
+      <w:start w:val="1"/>
+      <w:numFmt w:val="none"/>
+      <w:suff w:val="nothing"/>
+      <w:lvlText w:val=""/>
+      <w:lvlJc w:val="start"/>
+      <w:pPr>
+        <w:tabs>
+          <w:tab w:val="num" w:pos="0"/>
+        </w:tabs>
+        <w:ind w:start="0" w:hanging="0"/>
+      </w:pPr>
+    </w:lvl>
+    <w:lvl w:ilvl="5">
+      <w:start w:val="1"/>
+      <w:numFmt w:val="none"/>
+      <w:suff w:val="nothing"/>
+      <w:lvlText w:val=""/>
+      <w:lvlJc w:val="start"/>
+      <w:pPr>
+        <w:tabs>
+          <w:tab w:val="num" w:pos="0"/>
+        </w:tabs>
+        <w:ind w:start="0" w:hanging="0"/>
+      </w:pPr>
+    </w:lvl>
+    <w:lvl w:ilvl="6">
+      <w:start w:val="1"/>
+      <w:numFmt w:val="none"/>
+      <w:suff w:val="nothing"/>
+      <w:lvlText w:val=""/>
+      <w:lvlJc w:val="start"/>
+      <w:pPr>
+        <w:tabs>
+          <w:tab w:val="num" w:pos="0"/>
+        </w:tabs>
+        <w:ind w:start="0" w:hanging="0"/>
+      </w:pPr>
+    </w:lvl>
+    <w:lvl w:ilvl="7">
+      <w:start w:val="1"/>
+      <w:numFmt w:val="none"/>
+      <w:suff w:val="nothing"/>
+      <w:lvlText w:val=""/>
+      <w:lvlJc w:val="start"/>
+      <w:pPr>
+        <w:tabs>
+          <w:tab w:val="num" w:pos="0"/>
+        </w:tabs>
+        <w:ind w:start="0" w:hanging="0"/>
+      </w:pPr>
+    </w:lvl>
+    <w:lvl w:ilvl="8">
+      <w:start w:val="1"/>
+      <w:numFmt w:val="none"/>
+      <w:suff w:val="nothing"/>
+      <w:lvlText w:val=""/>
+      <w:lvlJc w:val="start"/>
+      <w:pPr>
+        <w:tabs>
+          <w:tab w:val="num" w:pos="0"/>
+        </w:tabs>
+        <w:ind w:start="0" w:hanging="0"/>
+      </w:pPr>
+    </w:lvl>
+  </w:abstractNum>
+  <w:num w:numId="1">
+    <w:abstractNumId w:val="1"/>
+  </w:num>
+  <w:num w:numId="2">
+    <w:abstractNumId w:val="2"/>
+  </w:num>
+</w:numbering>
 </file>
 
 <file path=word/styles.xml><?xml version="1.0" encoding="utf-8"?>
@@ -587,6 +1188,20 @@
       <w:sz w:val="24"/>
       <w:szCs w:val="24"/>
       <w:lang w:val="en-IN" w:eastAsia="zh-CN" w:bidi="hi-IN"/>
+    </w:rPr>
+  </w:style>
+  <w:style w:type="character" w:styleId="SourceText">
+    <w:name w:val="Source Text"/>
+    <w:qFormat/>
+    <w:rPr>
+      <w:rFonts w:ascii="Liberation Mono" w:hAnsi="Liberation Mono" w:eastAsia="Noto Sans Mono CJK SC" w:cs="Liberation Mono"/>
+    </w:rPr>
+  </w:style>
+  <w:style w:type="character" w:styleId="Bullets">
+    <w:name w:val="Bullets"/>
+    <w:qFormat/>
+    <w:rPr>
+      <w:rFonts w:ascii="OpenSymbol" w:hAnsi="OpenSymbol" w:eastAsia="OpenSymbol" w:cs="OpenSymbol"/>
     </w:rPr>
   </w:style>
   <w:style w:type="paragraph" w:styleId="Heading">
@@ -645,6 +1260,19 @@
     </w:pPr>
     <w:rPr>
       <w:rFonts w:cs="Noto Sans Devanagari"/>
+    </w:rPr>
+  </w:style>
+  <w:style w:type="paragraph" w:styleId="PreformattedText">
+    <w:name w:val="Preformatted Text"/>
+    <w:basedOn w:val="Normal"/>
+    <w:qFormat/>
+    <w:pPr>
+      <w:spacing w:before="0" w:after="0"/>
+    </w:pPr>
+    <w:rPr>
+      <w:rFonts w:ascii="Liberation Mono" w:hAnsi="Liberation Mono" w:eastAsia="Noto Sans Mono CJK SC" w:cs="Liberation Mono"/>
+      <w:sz w:val="20"/>
+      <w:szCs w:val="20"/>
     </w:rPr>
   </w:style>
 </w:styles>

</xml_diff>